<commit_message>
adding testimonials and why? me?
</commit_message>
<xml_diff>
--- a/src/static/resume.docx
+++ b/src/static/resume.docx
@@ -4295,6 +4295,246 @@
       </w:pPr>
       <w:r>
         <w:t xml:space="preserve">Conducted regulatory technical analyses, managed preparation of technical business proposals, managed a waste brokerage program</w:t>
+      </w:r>
+    </w:p>
+    <w:p>
+      <w:pPr>
+        <w:pStyle w:val="Heading1"/>
+        <w:keepNext/>
+      </w:pPr>
+      <w:r>
+        <w:t xml:space="preserve">TESTIMONIALS</w:t>
+      </w:r>
+    </w:p>
+    <w:p>
+      <w:pPr>
+        <w:spacing w:after="100"/>
+      </w:pPr>
+      <w:r>
+        <w:t xml:space="preserve">"Doug is a brilliant front-end engineer who stands out for his exceptional professionalism, team-player attitude, and a strong sense of ownership. He goes out of his way to ensure that projects are delivered on time and to the highest possible standard. Doug is great at leading other developers and working across disciplines, he's an expert in prioritization and can dissect complex problems. His perfectionism and ability to set a great example for the team have been invaluable. I had the chance to work with Doug on multiple Web3 projects throughout the years and I would always look forward to an opportunity to work with him."</w:t>
+      </w:r>
+    </w:p>
+    <w:p>
+      <w:pPr>
+        <w:keepNext/>
+        <w:spacing w:after="0" w:before="260"/>
+      </w:pPr>
+      <w:r>
+        <w:rPr>
+          <w:b/>
+          <w:bCs/>
+        </w:rPr>
+        <w:t xml:space="preserve">Renç Korzay, Web3 Product Manager (Curve Labs)</w:t>
+      </w:r>
+    </w:p>
+    <w:p>
+      <w:pPr>
+        <w:keepNext w:val="false"/>
+        <w:spacing w:after="0"/>
+      </w:pPr>
+      <w:hyperlink w:history="1" r:id="rIdLink30">
+        <w:r>
+          <w:rPr>
+            <w:rStyle w:val="Hyperlink"/>
+          </w:rPr>
+          <w:t xml:space="preserve">https://www.linkedin.com/in/renckorzay/</w:t>
+        </w:r>
+      </w:hyperlink>
+    </w:p>
+    <w:p>
+      <w:pPr>
+        <w:spacing w:after="100" w:before="260"/>
+      </w:pPr>
+      <w:r>
+        <w:t xml:space="preserve">"It's rare that you come across standout talent like Doug. I hired Doug as an application developer in my analytics team at PSP. He was able to complete the development of complex data products with complex custom visualizations on time. I was particularly impressed by Doug’s ability to precisely understand business requirements effortlessly due to his extensive experience as well as being an amazing team player."</w:t>
+      </w:r>
+    </w:p>
+    <w:p>
+      <w:pPr>
+        <w:keepNext/>
+        <w:spacing w:after="0" w:before="260"/>
+      </w:pPr>
+      <w:r>
+        <w:rPr>
+          <w:b/>
+          <w:bCs/>
+        </w:rPr>
+        <w:t xml:space="preserve">Ghalem Ben Nouna, Senior Director of Data Management and Business Intelligence at Ivanhoé Cambridge (PSP Investments)</w:t>
+      </w:r>
+    </w:p>
+    <w:p>
+      <w:pPr>
+        <w:keepNext w:val="false"/>
+        <w:spacing w:after="0"/>
+      </w:pPr>
+      <w:hyperlink w:history="1" r:id="rIdLink31">
+        <w:r>
+          <w:rPr>
+            <w:rStyle w:val="Hyperlink"/>
+          </w:rPr>
+          <w:t xml:space="preserve">https://www.linkedin.com/in/ghalem-ben-nouna-2356011/</w:t>
+        </w:r>
+      </w:hyperlink>
+    </w:p>
+    <w:p>
+      <w:pPr>
+        <w:spacing w:after="100" w:before="260"/>
+      </w:pPr>
+      <w:r>
+        <w:t xml:space="preserve">"I know Doug Kent both personally and professionally. I have had the great pleasure of working with him on several projects at multiple companies. These include industry changing applications like Shiftwise (healthcare staffing vendor management systems) and at large companies like GE . He is a highly reliable and methodical .NET web developer, and the best OO developer I've worked with. Doug works well solo and on teams and is an excellent communicator in both settings. On that point, he is an open and honest person and one who is not afraid to speak up (appropriately) when necessary. He is my go to .NET developer for these reasons, and also because he takes full ownership of his work; including peripheral dependencies, and will self manage through to completion."</w:t>
+      </w:r>
+    </w:p>
+    <w:p>
+      <w:pPr>
+        <w:keepNext/>
+        <w:spacing w:after="0" w:before="260"/>
+      </w:pPr>
+      <w:r>
+        <w:rPr>
+          <w:b/>
+          <w:bCs/>
+        </w:rPr>
+        <w:t xml:space="preserve">Ross Barbieri, Serial Entrepreneur, CTO and Software Development Manager (Shiftwise)</w:t>
+      </w:r>
+    </w:p>
+    <w:p>
+      <w:pPr>
+        <w:keepNext w:val="false"/>
+        <w:spacing w:after="0"/>
+      </w:pPr>
+      <w:hyperlink w:history="1" r:id="rIdLink32">
+        <w:r>
+          <w:rPr>
+            <w:rStyle w:val="Hyperlink"/>
+          </w:rPr>
+          <w:t xml:space="preserve">https://www.linkedin.com/in/rosshere/</w:t>
+        </w:r>
+      </w:hyperlink>
+    </w:p>
+    <w:p>
+      <w:pPr>
+        <w:pStyle w:val="Heading1"/>
+        <w:keepNext/>
+      </w:pPr>
+      <w:r>
+        <w:t xml:space="preserve">PROFESSIONAL APPROACH</w:t>
+      </w:r>
+    </w:p>
+    <w:p>
+      <w:pPr>
+        <w:pStyle w:val="ListParagraph"/>
+        <w:numPr>
+          <w:ilvl w:val="0"/>
+          <w:numId w:val="1"/>
+        </w:numPr>
+        <w:spacing w:after="60"/>
+      </w:pPr>
+      <w:r>
+        <w:t xml:space="preserve">I have the maturity and experience to design, develop, coordinate, and lead a team from product conception to release.</w:t>
+      </w:r>
+    </w:p>
+    <w:p>
+      <w:pPr>
+        <w:pStyle w:val="ListParagraph"/>
+        <w:numPr>
+          <w:ilvl w:val="0"/>
+          <w:numId w:val="1"/>
+        </w:numPr>
+        <w:spacing w:after="60"/>
+      </w:pPr>
+      <w:r>
+        <w:t xml:space="preserve">I can put AI to work on real implementation while supplying what it lacks — the judgment, earned over decades, to recognize when a plausible-looking design is wrong.</w:t>
+      </w:r>
+    </w:p>
+    <w:p>
+      <w:pPr>
+        <w:pStyle w:val="ListParagraph"/>
+        <w:numPr>
+          <w:ilvl w:val="0"/>
+          <w:numId w:val="1"/>
+        </w:numPr>
+        <w:spacing w:after="60"/>
+      </w:pPr>
+      <w:r>
+        <w:t xml:space="preserve">I have the broad full-stack knowledge and self-starting mentality to single-handedly architect, design, implement, document, test and deploy an entire application.</w:t>
+      </w:r>
+    </w:p>
+    <w:p>
+      <w:pPr>
+        <w:pStyle w:val="ListParagraph"/>
+        <w:numPr>
+          <w:ilvl w:val="0"/>
+          <w:numId w:val="1"/>
+        </w:numPr>
+        <w:spacing w:after="60"/>
+      </w:pPr>
+      <w:r>
+        <w:t xml:space="preserve">I have worked with some of the best programmers and managers at some of the greatest software companies in the world.</w:t>
+      </w:r>
+    </w:p>
+    <w:p>
+      <w:pPr>
+        <w:pStyle w:val="ListParagraph"/>
+        <w:numPr>
+          <w:ilvl w:val="0"/>
+          <w:numId w:val="1"/>
+        </w:numPr>
+        <w:spacing w:after="60"/>
+      </w:pPr>
+      <w:r>
+        <w:t xml:space="preserve">I am a great team player, leader and communicator, fully embracing team diversity and cohesiveness.</w:t>
+      </w:r>
+    </w:p>
+    <w:p>
+      <w:pPr>
+        <w:pStyle w:val="ListParagraph"/>
+        <w:numPr>
+          <w:ilvl w:val="0"/>
+          <w:numId w:val="1"/>
+        </w:numPr>
+        <w:spacing w:after="60"/>
+      </w:pPr>
+      <w:r>
+        <w:t xml:space="preserve">I am creative and love solving challenging problems.</w:t>
+      </w:r>
+    </w:p>
+    <w:p>
+      <w:pPr>
+        <w:pStyle w:val="ListParagraph"/>
+        <w:numPr>
+          <w:ilvl w:val="0"/>
+          <w:numId w:val="1"/>
+        </w:numPr>
+        <w:spacing w:after="60"/>
+      </w:pPr>
+      <w:r>
+        <w:t xml:space="preserve">I enjoy mentoring anyone who seeks it.</w:t>
+      </w:r>
+    </w:p>
+    <w:p>
+      <w:pPr>
+        <w:pStyle w:val="ListParagraph"/>
+        <w:numPr>
+          <w:ilvl w:val="0"/>
+          <w:numId w:val="1"/>
+        </w:numPr>
+        <w:spacing w:after="60"/>
+      </w:pPr>
+      <w:r>
+        <w:t xml:space="preserve">I am reliable and honest: I speak truth to clients and colleagues.</w:t>
+      </w:r>
+    </w:p>
+    <w:p>
+      <w:pPr>
+        <w:pStyle w:val="ListParagraph"/>
+        <w:numPr>
+          <w:ilvl w:val="0"/>
+          <w:numId w:val="1"/>
+        </w:numPr>
+        <w:spacing w:after="60"/>
+      </w:pPr>
+      <w:r>
+        <w:t xml:space="preserve">I try to view situations from your point of view to anticipate your needs and assist you in building your antifragility.</w:t>
       </w:r>
     </w:p>
     <w:p>

</xml_diff>

<commit_message>
moved the two new sections
</commit_message>
<xml_diff>
--- a/src/static/resume.docx
+++ b/src/static/resume.docx
@@ -382,6 +382,246 @@
         <w:keepNext/>
       </w:pPr>
       <w:r>
+        <w:t xml:space="preserve">TESTIMONIALS</w:t>
+      </w:r>
+    </w:p>
+    <w:p>
+      <w:pPr>
+        <w:spacing w:after="100"/>
+      </w:pPr>
+      <w:r>
+        <w:t xml:space="preserve">"Doug is a brilliant front-end engineer who stands out for his exceptional professionalism, team-player attitude, and a strong sense of ownership. He goes out of his way to ensure that projects are delivered on time and to the highest possible standard. Doug is great at leading other developers and working across disciplines, he's an expert in prioritization and can dissect complex problems. His perfectionism and ability to set a great example for the team have been invaluable. I had the chance to work with Doug on multiple Web3 projects throughout the years and I would always look forward to an opportunity to work with him."</w:t>
+      </w:r>
+    </w:p>
+    <w:p>
+      <w:pPr>
+        <w:keepNext/>
+        <w:spacing w:after="0" w:before="260"/>
+      </w:pPr>
+      <w:r>
+        <w:rPr>
+          <w:b/>
+          <w:bCs/>
+        </w:rPr>
+        <w:t xml:space="preserve">Renç Korzay, Web3 Product Manager (Curve Labs)</w:t>
+      </w:r>
+    </w:p>
+    <w:p>
+      <w:pPr>
+        <w:keepNext w:val="false"/>
+        <w:spacing w:after="0"/>
+      </w:pPr>
+      <w:hyperlink w:history="1" r:id="rIdLink4">
+        <w:r>
+          <w:rPr>
+            <w:rStyle w:val="Hyperlink"/>
+          </w:rPr>
+          <w:t xml:space="preserve">https://www.linkedin.com/in/renckorzay/</w:t>
+        </w:r>
+      </w:hyperlink>
+    </w:p>
+    <w:p>
+      <w:pPr>
+        <w:spacing w:after="100" w:before="260"/>
+      </w:pPr>
+      <w:r>
+        <w:t xml:space="preserve">"It's rare that you come across standout talent like Doug. I hired Doug as an application developer in my analytics team at PSP. He was able to complete the development of complex data products with complex custom visualizations on time. I was particularly impressed by Doug’s ability to precisely understand business requirements effortlessly due to his extensive experience as well as being an amazing team player."</w:t>
+      </w:r>
+    </w:p>
+    <w:p>
+      <w:pPr>
+        <w:keepNext/>
+        <w:spacing w:after="0" w:before="260"/>
+      </w:pPr>
+      <w:r>
+        <w:rPr>
+          <w:b/>
+          <w:bCs/>
+        </w:rPr>
+        <w:t xml:space="preserve">Ghalem Ben Nouna, Senior Director of Data Management and Business Intelligence at Ivanhoé Cambridge (PSP Investments)</w:t>
+      </w:r>
+    </w:p>
+    <w:p>
+      <w:pPr>
+        <w:keepNext w:val="false"/>
+        <w:spacing w:after="0"/>
+      </w:pPr>
+      <w:hyperlink w:history="1" r:id="rIdLink5">
+        <w:r>
+          <w:rPr>
+            <w:rStyle w:val="Hyperlink"/>
+          </w:rPr>
+          <w:t xml:space="preserve">https://www.linkedin.com/in/ghalem-ben-nouna-2356011/</w:t>
+        </w:r>
+      </w:hyperlink>
+    </w:p>
+    <w:p>
+      <w:pPr>
+        <w:spacing w:after="100" w:before="260"/>
+      </w:pPr>
+      <w:r>
+        <w:t xml:space="preserve">"I know Doug Kent both personally and professionally. I have had the great pleasure of working with him on several projects at multiple companies. These include industry changing applications like Shiftwise (healthcare staffing vendor management systems) and at large companies like GE . He is a highly reliable and methodical .NET web developer, and the best OO developer I've worked with. Doug works well solo and on teams and is an excellent communicator in both settings. On that point, he is an open and honest person and one who is not afraid to speak up (appropriately) when necessary. He is my go to .NET developer for these reasons, and also because he takes full ownership of his work; including peripheral dependencies, and will self manage through to completion."</w:t>
+      </w:r>
+    </w:p>
+    <w:p>
+      <w:pPr>
+        <w:keepNext/>
+        <w:spacing w:after="0" w:before="260"/>
+      </w:pPr>
+      <w:r>
+        <w:rPr>
+          <w:b/>
+          <w:bCs/>
+        </w:rPr>
+        <w:t xml:space="preserve">Ross Barbieri, Serial Entrepreneur, CTO and Software Development Manager (Shiftwise)</w:t>
+      </w:r>
+    </w:p>
+    <w:p>
+      <w:pPr>
+        <w:keepNext w:val="false"/>
+        <w:spacing w:after="0"/>
+      </w:pPr>
+      <w:hyperlink w:history="1" r:id="rIdLink6">
+        <w:r>
+          <w:rPr>
+            <w:rStyle w:val="Hyperlink"/>
+          </w:rPr>
+          <w:t xml:space="preserve">https://www.linkedin.com/in/rosshere/</w:t>
+        </w:r>
+      </w:hyperlink>
+    </w:p>
+    <w:p>
+      <w:pPr>
+        <w:pStyle w:val="Heading1"/>
+        <w:keepNext/>
+      </w:pPr>
+      <w:r>
+        <w:t xml:space="preserve">WHAT YOU CAN EXPECT FROM ME</w:t>
+      </w:r>
+    </w:p>
+    <w:p>
+      <w:pPr>
+        <w:pStyle w:val="ListParagraph"/>
+        <w:numPr>
+          <w:ilvl w:val="0"/>
+          <w:numId w:val="1"/>
+        </w:numPr>
+        <w:spacing w:after="60"/>
+      </w:pPr>
+      <w:r>
+        <w:t xml:space="preserve">I have the maturity and experience to design, develop, coordinate, and lead a team from product conception to release.</w:t>
+      </w:r>
+    </w:p>
+    <w:p>
+      <w:pPr>
+        <w:pStyle w:val="ListParagraph"/>
+        <w:numPr>
+          <w:ilvl w:val="0"/>
+          <w:numId w:val="1"/>
+        </w:numPr>
+        <w:spacing w:after="60"/>
+      </w:pPr>
+      <w:r>
+        <w:t xml:space="preserve">I can put AI to work on real implementation while supplying what it lacks — the judgment, earned over decades, to recognize when a plausible-looking design is wrong.</w:t>
+      </w:r>
+    </w:p>
+    <w:p>
+      <w:pPr>
+        <w:pStyle w:val="ListParagraph"/>
+        <w:numPr>
+          <w:ilvl w:val="0"/>
+          <w:numId w:val="1"/>
+        </w:numPr>
+        <w:spacing w:after="60"/>
+      </w:pPr>
+      <w:r>
+        <w:t xml:space="preserve">I have the broad full-stack knowledge and self-starting mentality to single-handedly architect, design, implement, document, test and deploy an entire application.</w:t>
+      </w:r>
+    </w:p>
+    <w:p>
+      <w:pPr>
+        <w:pStyle w:val="ListParagraph"/>
+        <w:numPr>
+          <w:ilvl w:val="0"/>
+          <w:numId w:val="1"/>
+        </w:numPr>
+        <w:spacing w:after="60"/>
+      </w:pPr>
+      <w:r>
+        <w:t xml:space="preserve">I have worked with some of the best programmers and managers at some of the greatest software companies in the world.</w:t>
+      </w:r>
+    </w:p>
+    <w:p>
+      <w:pPr>
+        <w:pStyle w:val="ListParagraph"/>
+        <w:numPr>
+          <w:ilvl w:val="0"/>
+          <w:numId w:val="1"/>
+        </w:numPr>
+        <w:spacing w:after="60"/>
+      </w:pPr>
+      <w:r>
+        <w:t xml:space="preserve">I am a great team player, leader and communicator, fully embracing team diversity and cohesiveness.</w:t>
+      </w:r>
+    </w:p>
+    <w:p>
+      <w:pPr>
+        <w:pStyle w:val="ListParagraph"/>
+        <w:numPr>
+          <w:ilvl w:val="0"/>
+          <w:numId w:val="1"/>
+        </w:numPr>
+        <w:spacing w:after="60"/>
+      </w:pPr>
+      <w:r>
+        <w:t xml:space="preserve">I am creative and love solving challenging problems.</w:t>
+      </w:r>
+    </w:p>
+    <w:p>
+      <w:pPr>
+        <w:pStyle w:val="ListParagraph"/>
+        <w:numPr>
+          <w:ilvl w:val="0"/>
+          <w:numId w:val="1"/>
+        </w:numPr>
+        <w:spacing w:after="60"/>
+      </w:pPr>
+      <w:r>
+        <w:t xml:space="preserve">I enjoy mentoring anyone who seeks it.</w:t>
+      </w:r>
+    </w:p>
+    <w:p>
+      <w:pPr>
+        <w:pStyle w:val="ListParagraph"/>
+        <w:numPr>
+          <w:ilvl w:val="0"/>
+          <w:numId w:val="1"/>
+        </w:numPr>
+        <w:spacing w:after="60"/>
+      </w:pPr>
+      <w:r>
+        <w:t xml:space="preserve">I am reliable and honest: I speak truth to clients and colleagues.</w:t>
+      </w:r>
+    </w:p>
+    <w:p>
+      <w:pPr>
+        <w:pStyle w:val="ListParagraph"/>
+        <w:numPr>
+          <w:ilvl w:val="0"/>
+          <w:numId w:val="1"/>
+        </w:numPr>
+        <w:spacing w:after="60"/>
+      </w:pPr>
+      <w:r>
+        <w:t xml:space="preserve">I try to view situations from your point of view to anticipate your needs and assist you in building your antifragility.</w:t>
+      </w:r>
+    </w:p>
+    <w:p>
+      <w:pPr>
+        <w:pStyle w:val="Heading1"/>
+        <w:keepNext/>
+      </w:pPr>
+      <w:r>
         <w:t xml:space="preserve">SKILLS AND TECHNOLOGIES</w:t>
       </w:r>
     </w:p>
@@ -741,7 +981,7 @@
         <w:keepNext/>
         <w:spacing w:after="0"/>
       </w:pPr>
-      <w:hyperlink w:history="1" r:id="rIdLink4">
+      <w:hyperlink w:history="1" r:id="rIdLink7">
         <w:r>
           <w:rPr>
             <w:rStyle w:val="Hyperlink"/>
@@ -933,7 +1173,7 @@
         <w:keepNext/>
         <w:spacing w:after="0"/>
       </w:pPr>
-      <w:hyperlink w:history="1" r:id="rIdLink5">
+      <w:hyperlink w:history="1" r:id="rIdLink8">
         <w:r>
           <w:rPr>
             <w:rStyle w:val="Hyperlink"/>
@@ -1073,7 +1313,7 @@
         <w:keepNext/>
         <w:spacing w:after="0"/>
       </w:pPr>
-      <w:hyperlink w:history="1" r:id="rIdLink6">
+      <w:hyperlink w:history="1" r:id="rIdLink9">
         <w:r>
           <w:rPr>
             <w:rStyle w:val="Hyperlink"/>
@@ -1252,7 +1492,7 @@
         <w:keepNext/>
         <w:spacing w:after="0"/>
       </w:pPr>
-      <w:hyperlink w:history="1" r:id="rIdLink7">
+      <w:hyperlink w:history="1" r:id="rIdLink10">
         <w:r>
           <w:rPr>
             <w:rStyle w:val="Hyperlink"/>
@@ -1405,7 +1645,7 @@
         <w:keepNext/>
         <w:spacing w:after="0"/>
       </w:pPr>
-      <w:hyperlink w:history="1" r:id="rIdLink8">
+      <w:hyperlink w:history="1" r:id="rIdLink11">
         <w:r>
           <w:rPr>
             <w:rStyle w:val="Hyperlink"/>
@@ -1636,7 +1876,7 @@
         <w:keepNext/>
         <w:spacing w:after="0"/>
       </w:pPr>
-      <w:hyperlink w:history="1" r:id="rIdLink9">
+      <w:hyperlink w:history="1" r:id="rIdLink12">
         <w:r>
           <w:rPr>
             <w:rStyle w:val="Hyperlink"/>
@@ -1815,7 +2055,7 @@
         <w:keepNext/>
         <w:spacing w:after="0"/>
       </w:pPr>
-      <w:hyperlink w:history="1" r:id="rIdLink10">
+      <w:hyperlink w:history="1" r:id="rIdLink13">
         <w:r>
           <w:rPr>
             <w:rStyle w:val="Hyperlink"/>
@@ -1916,7 +2156,7 @@
         <w:keepNext/>
         <w:spacing w:after="0"/>
       </w:pPr>
-      <w:hyperlink w:history="1" r:id="rIdLink11">
+      <w:hyperlink w:history="1" r:id="rIdLink14">
         <w:r>
           <w:rPr>
             <w:rStyle w:val="Hyperlink"/>
@@ -2056,7 +2296,7 @@
         <w:keepNext/>
         <w:spacing w:after="0"/>
       </w:pPr>
-      <w:hyperlink w:history="1" r:id="rIdLink12">
+      <w:hyperlink w:history="1" r:id="rIdLink15">
         <w:r>
           <w:rPr>
             <w:rStyle w:val="Hyperlink"/>
@@ -2209,7 +2449,7 @@
         <w:keepNext/>
         <w:spacing w:after="0"/>
       </w:pPr>
-      <w:hyperlink w:history="1" r:id="rIdLink13">
+      <w:hyperlink w:history="1" r:id="rIdLink16">
         <w:r>
           <w:rPr>
             <w:rStyle w:val="Hyperlink"/>
@@ -2575,7 +2815,7 @@
         <w:keepNext/>
         <w:spacing w:after="0"/>
       </w:pPr>
-      <w:hyperlink w:history="1" r:id="rIdLink14">
+      <w:hyperlink w:history="1" r:id="rIdLink17">
         <w:r>
           <w:rPr>
             <w:rStyle w:val="Hyperlink"/>
@@ -2741,7 +2981,7 @@
         <w:keepNext/>
         <w:spacing w:after="0"/>
       </w:pPr>
-      <w:hyperlink w:history="1" r:id="rIdLink15">
+      <w:hyperlink w:history="1" r:id="rIdLink18">
         <w:r>
           <w:rPr>
             <w:rStyle w:val="Hyperlink"/>
@@ -2907,7 +3147,7 @@
         <w:keepNext/>
         <w:spacing w:after="0"/>
       </w:pPr>
-      <w:hyperlink w:history="1" r:id="rIdLink16">
+      <w:hyperlink w:history="1" r:id="rIdLink19">
         <w:r>
           <w:rPr>
             <w:rStyle w:val="Hyperlink"/>
@@ -3021,7 +3261,7 @@
         <w:keepNext/>
         <w:spacing w:after="0"/>
       </w:pPr>
-      <w:hyperlink w:history="1" r:id="rIdLink17">
+      <w:hyperlink w:history="1" r:id="rIdLink20">
         <w:r>
           <w:rPr>
             <w:rStyle w:val="Hyperlink"/>
@@ -3148,7 +3388,7 @@
         <w:keepNext/>
         <w:spacing w:after="0"/>
       </w:pPr>
-      <w:hyperlink w:history="1" r:id="rIdLink18">
+      <w:hyperlink w:history="1" r:id="rIdLink21">
         <w:r>
           <w:rPr>
             <w:rStyle w:val="Hyperlink"/>
@@ -3275,7 +3515,7 @@
         <w:keepNext/>
         <w:spacing w:after="0"/>
       </w:pPr>
-      <w:hyperlink w:history="1" r:id="rIdLink19">
+      <w:hyperlink w:history="1" r:id="rIdLink22">
         <w:r>
           <w:rPr>
             <w:rStyle w:val="Hyperlink"/>
@@ -3415,7 +3655,7 @@
         <w:keepNext/>
         <w:spacing w:after="0"/>
       </w:pPr>
-      <w:hyperlink w:history="1" r:id="rIdLink20">
+      <w:hyperlink w:history="1" r:id="rIdLink23">
         <w:r>
           <w:rPr>
             <w:rStyle w:val="Hyperlink"/>
@@ -3609,7 +3849,7 @@
         <w:keepNext/>
         <w:spacing w:after="0"/>
       </w:pPr>
-      <w:hyperlink w:history="1" r:id="rIdLink21">
+      <w:hyperlink w:history="1" r:id="rIdLink24">
         <w:r>
           <w:rPr>
             <w:rStyle w:val="Hyperlink"/>
@@ -3663,7 +3903,7 @@
         <w:keepNext/>
         <w:spacing w:after="0"/>
       </w:pPr>
-      <w:hyperlink w:history="1" r:id="rIdLink22">
+      <w:hyperlink w:history="1" r:id="rIdLink25">
         <w:r>
           <w:rPr>
             <w:rStyle w:val="Hyperlink"/>
@@ -3783,7 +4023,7 @@
         <w:keepNext/>
         <w:spacing w:after="0"/>
       </w:pPr>
-      <w:hyperlink w:history="1" r:id="rIdLink23">
+      <w:hyperlink w:history="1" r:id="rIdLink26">
         <w:r>
           <w:rPr>
             <w:rStyle w:val="Hyperlink"/>
@@ -3837,7 +4077,7 @@
         <w:keepNext/>
         <w:spacing w:after="0"/>
       </w:pPr>
-      <w:hyperlink w:history="1" r:id="rIdLink24">
+      <w:hyperlink w:history="1" r:id="rIdLink27">
         <w:r>
           <w:rPr>
             <w:rStyle w:val="Hyperlink"/>
@@ -3891,7 +4131,7 @@
         <w:keepNext/>
         <w:spacing w:after="0"/>
       </w:pPr>
-      <w:hyperlink w:history="1" r:id="rIdLink25">
+      <w:hyperlink w:history="1" r:id="rIdLink28">
         <w:r>
           <w:rPr>
             <w:rStyle w:val="Hyperlink"/>
@@ -4018,208 +4258,6 @@
       </w:pPr>
       <w:r>
         <w:t xml:space="preserve">University of North Carolina | 11/1988 - 12/1989</w:t>
-      </w:r>
-    </w:p>
-    <w:p>
-      <w:pPr>
-        <w:keepNext/>
-        <w:spacing w:after="0"/>
-      </w:pPr>
-      <w:hyperlink w:history="1" r:id="rIdLink26">
-        <w:r>
-          <w:rPr>
-            <w:rStyle w:val="Hyperlink"/>
-          </w:rPr>
-          <w:t xml:space="preserve">https://www.unc.edu/</w:t>
-        </w:r>
-      </w:hyperlink>
-    </w:p>
-    <w:p>
-      <w:pPr>
-        <w:keepNext/>
-        <w:spacing w:after="40" w:before="140"/>
-      </w:pPr>
-      <w:r>
-        <w:rPr>
-          <w:b/>
-          <w:bCs/>
-        </w:rPr>
-        <w:t xml:space="preserve">Description:</w:t>
-      </w:r>
-    </w:p>
-    <w:p>
-      <w:pPr>
-        <w:spacing w:after="100"/>
-      </w:pPr>
-      <w:r>
-        <w:t xml:space="preserve">For EGA/VGA graphics hardware, developed code that reproduces PGA 3D and 2D graphics hardware commands</w:t>
-      </w:r>
-    </w:p>
-    <w:p>
-      <w:pPr>
-        <w:pStyle w:val="Heading2"/>
-        <w:keepNext/>
-        <w:keepLines/>
-      </w:pPr>
-      <w:r>
-        <w:t xml:space="preserve">Software Engineer</w:t>
-      </w:r>
-    </w:p>
-    <w:p>
-      <w:pPr>
-        <w:keepNext/>
-        <w:spacing w:after="0"/>
-      </w:pPr>
-      <w:r>
-        <w:t xml:space="preserve">Dupont Design Technologies, Inc. | 03/1988 - 11/1988</w:t>
-      </w:r>
-    </w:p>
-    <w:p>
-      <w:pPr>
-        <w:keepNext/>
-        <w:spacing w:after="40" w:before="140"/>
-      </w:pPr>
-      <w:r>
-        <w:rPr>
-          <w:b/>
-          <w:bCs/>
-        </w:rPr>
-        <w:t xml:space="preserve">Description:</w:t>
-      </w:r>
-    </w:p>
-    <w:p>
-      <w:pPr>
-        <w:spacing w:after="100"/>
-      </w:pPr>
-      <w:r>
-        <w:t xml:space="preserve">Developed object-oriented, resolution-independent 2D graphics code, including airbrushes, framebuffer manager, and graphics hardware emulator</w:t>
-      </w:r>
-    </w:p>
-    <w:p>
-      <w:pPr>
-        <w:pStyle w:val="Heading2"/>
-        <w:keepNext/>
-        <w:keepLines/>
-      </w:pPr>
-      <w:r>
-        <w:t xml:space="preserve">Sole Software Engineer</w:t>
-      </w:r>
-    </w:p>
-    <w:p>
-      <w:pPr>
-        <w:keepNext/>
-        <w:spacing w:after="0"/>
-      </w:pPr>
-      <w:r>
-        <w:t xml:space="preserve">SAS Institute Inc. | 12/1986 - 05/1987</w:t>
-      </w:r>
-    </w:p>
-    <w:p>
-      <w:pPr>
-        <w:keepNext/>
-        <w:spacing w:after="0"/>
-      </w:pPr>
-      <w:hyperlink w:history="1" r:id="rIdLink27">
-        <w:r>
-          <w:rPr>
-            <w:rStyle w:val="Hyperlink"/>
-          </w:rPr>
-          <w:t xml:space="preserve">https://www.sas.com/</w:t>
-        </w:r>
-      </w:hyperlink>
-    </w:p>
-    <w:p>
-      <w:pPr>
-        <w:keepNext/>
-        <w:spacing w:after="40" w:before="140"/>
-      </w:pPr>
-      <w:r>
-        <w:rPr>
-          <w:b/>
-          <w:bCs/>
-        </w:rPr>
-        <w:t xml:space="preserve">Description:</w:t>
-      </w:r>
-    </w:p>
-    <w:p>
-      <w:pPr>
-        <w:spacing w:after="100"/>
-      </w:pPr>
-      <w:r>
-        <w:t xml:space="preserve">Ported Visuals (see UNC below) to the SAS Graphical User Interface System</w:t>
-      </w:r>
-    </w:p>
-    <w:p>
-      <w:pPr>
-        <w:pStyle w:val="Heading2"/>
-        <w:keepNext/>
-        <w:keepLines/>
-      </w:pPr>
-      <w:r>
-        <w:t xml:space="preserve">Software Engineer</w:t>
-      </w:r>
-    </w:p>
-    <w:p>
-      <w:pPr>
-        <w:keepNext/>
-        <w:spacing w:after="0"/>
-      </w:pPr>
-      <w:r>
-        <w:t xml:space="preserve">University of North Carolina | 05/1986 - 11/1986</w:t>
-      </w:r>
-    </w:p>
-    <w:p>
-      <w:pPr>
-        <w:keepNext/>
-        <w:spacing w:after="0"/>
-      </w:pPr>
-      <w:hyperlink w:history="1" r:id="rIdLink28">
-        <w:r>
-          <w:rPr>
-            <w:rStyle w:val="Hyperlink"/>
-          </w:rPr>
-          <w:t xml:space="preserve">https://www.unc.edu/</w:t>
-        </w:r>
-      </w:hyperlink>
-    </w:p>
-    <w:p>
-      <w:pPr>
-        <w:keepNext/>
-        <w:spacing w:after="40" w:before="140"/>
-      </w:pPr>
-      <w:r>
-        <w:rPr>
-          <w:b/>
-          <w:bCs/>
-        </w:rPr>
-        <w:t xml:space="preserve">Description:</w:t>
-      </w:r>
-    </w:p>
-    <w:p>
-      <w:pPr>
-        <w:spacing w:after="100"/>
-      </w:pPr>
-      <w:r>
-        <w:t xml:space="preserve">Assembled a local area network (LAN) and a system to digitize and manipulate video microscopic images for display in medical school classroom lab sessions</w:t>
-      </w:r>
-    </w:p>
-    <w:p>
-      <w:pPr>
-        <w:pStyle w:val="Heading2"/>
-        <w:keepNext/>
-        <w:keepLines/>
-      </w:pPr>
-      <w:r>
-        <w:t xml:space="preserve">Sole Software Engineer</w:t>
-      </w:r>
-    </w:p>
-    <w:p>
-      <w:pPr>
-        <w:keepNext/>
-        <w:spacing w:after="0"/>
-      </w:pPr>
-      <w:r>
-        <w:t xml:space="preserve">University of North Carolina | 05/1985 - 11/1986</w:t>
       </w:r>
     </w:p>
     <w:p>
@@ -4254,7 +4292,7 @@
         <w:spacing w:after="100"/>
       </w:pPr>
       <w:r>
-        <w:t xml:space="preserve">Wrote Visuals, an application that uses interactive 3D graphics animation to reveal meaning in multidimensional statistical data</w:t>
+        <w:t xml:space="preserve">For EGA/VGA graphics hardware, developed code that reproduces PGA 3D and 2D graphics hardware commands</w:t>
       </w:r>
     </w:p>
     <w:p>
@@ -4264,16 +4302,16 @@
         <w:keepLines/>
       </w:pPr>
       <w:r>
-        <w:t xml:space="preserve">Associate Public Policy Analyst</w:t>
-      </w:r>
-    </w:p>
-    <w:p>
-      <w:pPr>
-        <w:keepNext/>
-        <w:spacing w:after="0"/>
-      </w:pPr>
-      <w:r>
-        <w:t xml:space="preserve">Pacific Environmental Services, Inc | 01/1980 - 09/1982</w:t>
+        <w:t xml:space="preserve">Software Engineer</w:t>
+      </w:r>
+    </w:p>
+    <w:p>
+      <w:pPr>
+        <w:keepNext/>
+        <w:spacing w:after="0"/>
+      </w:pPr>
+      <w:r>
+        <w:t xml:space="preserve">Dupont Design Technologies, Inc. | 03/1988 - 11/1988</w:t>
       </w:r>
     </w:p>
     <w:p>
@@ -4294,42 +4332,31 @@
         <w:spacing w:after="100"/>
       </w:pPr>
       <w:r>
-        <w:t xml:space="preserve">Conducted regulatory technical analyses, managed preparation of technical business proposals, managed a waste brokerage program</w:t>
-      </w:r>
-    </w:p>
-    <w:p>
-      <w:pPr>
-        <w:pStyle w:val="Heading1"/>
-        <w:keepNext/>
-      </w:pPr>
-      <w:r>
-        <w:t xml:space="preserve">TESTIMONIALS</w:t>
-      </w:r>
-    </w:p>
-    <w:p>
-      <w:pPr>
-        <w:spacing w:after="100"/>
-      </w:pPr>
-      <w:r>
-        <w:t xml:space="preserve">"Doug is a brilliant front-end engineer who stands out for his exceptional professionalism, team-player attitude, and a strong sense of ownership. He goes out of his way to ensure that projects are delivered on time and to the highest possible standard. Doug is great at leading other developers and working across disciplines, he's an expert in prioritization and can dissect complex problems. His perfectionism and ability to set a great example for the team have been invaluable. I had the chance to work with Doug on multiple Web3 projects throughout the years and I would always look forward to an opportunity to work with him."</w:t>
-      </w:r>
-    </w:p>
-    <w:p>
-      <w:pPr>
-        <w:keepNext/>
-        <w:spacing w:after="0" w:before="260"/>
-      </w:pPr>
-      <w:r>
-        <w:rPr>
-          <w:b/>
-          <w:bCs/>
-        </w:rPr>
-        <w:t xml:space="preserve">Renç Korzay, Web3 Product Manager (Curve Labs)</w:t>
-      </w:r>
-    </w:p>
-    <w:p>
-      <w:pPr>
-        <w:keepNext w:val="false"/>
+        <w:t xml:space="preserve">Developed object-oriented, resolution-independent 2D graphics code, including airbrushes, framebuffer manager, and graphics hardware emulator</w:t>
+      </w:r>
+    </w:p>
+    <w:p>
+      <w:pPr>
+        <w:pStyle w:val="Heading2"/>
+        <w:keepNext/>
+        <w:keepLines/>
+      </w:pPr>
+      <w:r>
+        <w:t xml:space="preserve">Sole Software Engineer</w:t>
+      </w:r>
+    </w:p>
+    <w:p>
+      <w:pPr>
+        <w:keepNext/>
+        <w:spacing w:after="0"/>
+      </w:pPr>
+      <w:r>
+        <w:t xml:space="preserve">SAS Institute Inc. | 12/1986 - 05/1987</w:t>
+      </w:r>
+    </w:p>
+    <w:p>
+      <w:pPr>
+        <w:keepNext/>
         <w:spacing w:after="0"/>
       </w:pPr>
       <w:hyperlink w:history="1" r:id="rIdLink30">
@@ -4337,34 +4364,53 @@
           <w:rPr>
             <w:rStyle w:val="Hyperlink"/>
           </w:rPr>
-          <w:t xml:space="preserve">https://www.linkedin.com/in/renckorzay/</w:t>
+          <w:t xml:space="preserve">https://www.sas.com/</w:t>
         </w:r>
       </w:hyperlink>
     </w:p>
     <w:p>
       <w:pPr>
-        <w:spacing w:after="100" w:before="260"/>
-      </w:pPr>
-      <w:r>
-        <w:t xml:space="preserve">"It's rare that you come across standout talent like Doug. I hired Doug as an application developer in my analytics team at PSP. He was able to complete the development of complex data products with complex custom visualizations on time. I was particularly impressed by Doug’s ability to precisely understand business requirements effortlessly due to his extensive experience as well as being an amazing team player."</w:t>
-      </w:r>
-    </w:p>
-    <w:p>
-      <w:pPr>
-        <w:keepNext/>
-        <w:spacing w:after="0" w:before="260"/>
-      </w:pPr>
-      <w:r>
-        <w:rPr>
-          <w:b/>
-          <w:bCs/>
-        </w:rPr>
-        <w:t xml:space="preserve">Ghalem Ben Nouna, Senior Director of Data Management and Business Intelligence at Ivanhoé Cambridge (PSP Investments)</w:t>
-      </w:r>
-    </w:p>
-    <w:p>
-      <w:pPr>
-        <w:keepNext w:val="false"/>
+        <w:keepNext/>
+        <w:spacing w:after="40" w:before="140"/>
+      </w:pPr>
+      <w:r>
+        <w:rPr>
+          <w:b/>
+          <w:bCs/>
+        </w:rPr>
+        <w:t xml:space="preserve">Description:</w:t>
+      </w:r>
+    </w:p>
+    <w:p>
+      <w:pPr>
+        <w:spacing w:after="100"/>
+      </w:pPr>
+      <w:r>
+        <w:t xml:space="preserve">Ported Visuals (see UNC below) to the SAS Graphical User Interface System</w:t>
+      </w:r>
+    </w:p>
+    <w:p>
+      <w:pPr>
+        <w:pStyle w:val="Heading2"/>
+        <w:keepNext/>
+        <w:keepLines/>
+      </w:pPr>
+      <w:r>
+        <w:t xml:space="preserve">Software Engineer</w:t>
+      </w:r>
+    </w:p>
+    <w:p>
+      <w:pPr>
+        <w:keepNext/>
+        <w:spacing w:after="0"/>
+      </w:pPr>
+      <w:r>
+        <w:t xml:space="preserve">University of North Carolina | 05/1986 - 11/1986</w:t>
+      </w:r>
+    </w:p>
+    <w:p>
+      <w:pPr>
+        <w:keepNext/>
         <w:spacing w:after="0"/>
       </w:pPr>
       <w:hyperlink w:history="1" r:id="rIdLink31">
@@ -4372,34 +4418,53 @@
           <w:rPr>
             <w:rStyle w:val="Hyperlink"/>
           </w:rPr>
-          <w:t xml:space="preserve">https://www.linkedin.com/in/ghalem-ben-nouna-2356011/</w:t>
+          <w:t xml:space="preserve">https://www.unc.edu/</w:t>
         </w:r>
       </w:hyperlink>
     </w:p>
     <w:p>
       <w:pPr>
-        <w:spacing w:after="100" w:before="260"/>
-      </w:pPr>
-      <w:r>
-        <w:t xml:space="preserve">"I know Doug Kent both personally and professionally. I have had the great pleasure of working with him on several projects at multiple companies. These include industry changing applications like Shiftwise (healthcare staffing vendor management systems) and at large companies like GE . He is a highly reliable and methodical .NET web developer, and the best OO developer I've worked with. Doug works well solo and on teams and is an excellent communicator in both settings. On that point, he is an open and honest person and one who is not afraid to speak up (appropriately) when necessary. He is my go to .NET developer for these reasons, and also because he takes full ownership of his work; including peripheral dependencies, and will self manage through to completion."</w:t>
-      </w:r>
-    </w:p>
-    <w:p>
-      <w:pPr>
-        <w:keepNext/>
-        <w:spacing w:after="0" w:before="260"/>
-      </w:pPr>
-      <w:r>
-        <w:rPr>
-          <w:b/>
-          <w:bCs/>
-        </w:rPr>
-        <w:t xml:space="preserve">Ross Barbieri, Serial Entrepreneur, CTO and Software Development Manager (Shiftwise)</w:t>
-      </w:r>
-    </w:p>
-    <w:p>
-      <w:pPr>
-        <w:keepNext w:val="false"/>
+        <w:keepNext/>
+        <w:spacing w:after="40" w:before="140"/>
+      </w:pPr>
+      <w:r>
+        <w:rPr>
+          <w:b/>
+          <w:bCs/>
+        </w:rPr>
+        <w:t xml:space="preserve">Description:</w:t>
+      </w:r>
+    </w:p>
+    <w:p>
+      <w:pPr>
+        <w:spacing w:after="100"/>
+      </w:pPr>
+      <w:r>
+        <w:t xml:space="preserve">Assembled a local area network (LAN) and a system to digitize and manipulate video microscopic images for display in medical school classroom lab sessions</w:t>
+      </w:r>
+    </w:p>
+    <w:p>
+      <w:pPr>
+        <w:pStyle w:val="Heading2"/>
+        <w:keepNext/>
+        <w:keepLines/>
+      </w:pPr>
+      <w:r>
+        <w:t xml:space="preserve">Sole Software Engineer</w:t>
+      </w:r>
+    </w:p>
+    <w:p>
+      <w:pPr>
+        <w:keepNext/>
+        <w:spacing w:after="0"/>
+      </w:pPr>
+      <w:r>
+        <w:t xml:space="preserve">University of North Carolina | 05/1985 - 11/1986</w:t>
+      </w:r>
+    </w:p>
+    <w:p>
+      <w:pPr>
+        <w:keepNext/>
         <w:spacing w:after="0"/>
       </w:pPr>
       <w:hyperlink w:history="1" r:id="rIdLink32">
@@ -4407,134 +4472,69 @@
           <w:rPr>
             <w:rStyle w:val="Hyperlink"/>
           </w:rPr>
-          <w:t xml:space="preserve">https://www.linkedin.com/in/rosshere/</w:t>
+          <w:t xml:space="preserve">https://www.unc.edu/</w:t>
         </w:r>
       </w:hyperlink>
     </w:p>
     <w:p>
       <w:pPr>
-        <w:pStyle w:val="Heading1"/>
-        <w:keepNext/>
-      </w:pPr>
-      <w:r>
-        <w:t xml:space="preserve">WHAT YOU CAN EXPECT FROM ME</w:t>
-      </w:r>
-    </w:p>
-    <w:p>
-      <w:pPr>
-        <w:pStyle w:val="ListParagraph"/>
-        <w:numPr>
-          <w:ilvl w:val="0"/>
-          <w:numId w:val="1"/>
-        </w:numPr>
-        <w:spacing w:after="60"/>
-      </w:pPr>
-      <w:r>
-        <w:t xml:space="preserve">I have the maturity and experience to design, develop, coordinate, and lead a team from product conception to release.</w:t>
-      </w:r>
-    </w:p>
-    <w:p>
-      <w:pPr>
-        <w:pStyle w:val="ListParagraph"/>
-        <w:numPr>
-          <w:ilvl w:val="0"/>
-          <w:numId w:val="1"/>
-        </w:numPr>
-        <w:spacing w:after="60"/>
-      </w:pPr>
-      <w:r>
-        <w:t xml:space="preserve">I can put AI to work on real implementation while supplying what it lacks — the judgment, earned over decades, to recognize when a plausible-looking design is wrong.</w:t>
-      </w:r>
-    </w:p>
-    <w:p>
-      <w:pPr>
-        <w:pStyle w:val="ListParagraph"/>
-        <w:numPr>
-          <w:ilvl w:val="0"/>
-          <w:numId w:val="1"/>
-        </w:numPr>
-        <w:spacing w:after="60"/>
-      </w:pPr>
-      <w:r>
-        <w:t xml:space="preserve">I have the broad full-stack knowledge and self-starting mentality to single-handedly architect, design, implement, document, test and deploy an entire application.</w:t>
-      </w:r>
-    </w:p>
-    <w:p>
-      <w:pPr>
-        <w:pStyle w:val="ListParagraph"/>
-        <w:numPr>
-          <w:ilvl w:val="0"/>
-          <w:numId w:val="1"/>
-        </w:numPr>
-        <w:spacing w:after="60"/>
-      </w:pPr>
-      <w:r>
-        <w:t xml:space="preserve">I have worked with some of the best programmers and managers at some of the greatest software companies in the world.</w:t>
-      </w:r>
-    </w:p>
-    <w:p>
-      <w:pPr>
-        <w:pStyle w:val="ListParagraph"/>
-        <w:numPr>
-          <w:ilvl w:val="0"/>
-          <w:numId w:val="1"/>
-        </w:numPr>
-        <w:spacing w:after="60"/>
-      </w:pPr>
-      <w:r>
-        <w:t xml:space="preserve">I am a great team player, leader and communicator, fully embracing team diversity and cohesiveness.</w:t>
-      </w:r>
-    </w:p>
-    <w:p>
-      <w:pPr>
-        <w:pStyle w:val="ListParagraph"/>
-        <w:numPr>
-          <w:ilvl w:val="0"/>
-          <w:numId w:val="1"/>
-        </w:numPr>
-        <w:spacing w:after="60"/>
-      </w:pPr>
-      <w:r>
-        <w:t xml:space="preserve">I am creative and love solving challenging problems.</w:t>
-      </w:r>
-    </w:p>
-    <w:p>
-      <w:pPr>
-        <w:pStyle w:val="ListParagraph"/>
-        <w:numPr>
-          <w:ilvl w:val="0"/>
-          <w:numId w:val="1"/>
-        </w:numPr>
-        <w:spacing w:after="60"/>
-      </w:pPr>
-      <w:r>
-        <w:t xml:space="preserve">I enjoy mentoring anyone who seeks it.</w:t>
-      </w:r>
-    </w:p>
-    <w:p>
-      <w:pPr>
-        <w:pStyle w:val="ListParagraph"/>
-        <w:numPr>
-          <w:ilvl w:val="0"/>
-          <w:numId w:val="1"/>
-        </w:numPr>
-        <w:spacing w:after="60"/>
-      </w:pPr>
-      <w:r>
-        <w:t xml:space="preserve">I am reliable and honest: I speak truth to clients and colleagues.</w:t>
-      </w:r>
-    </w:p>
-    <w:p>
-      <w:pPr>
-        <w:pStyle w:val="ListParagraph"/>
-        <w:numPr>
-          <w:ilvl w:val="0"/>
-          <w:numId w:val="1"/>
-        </w:numPr>
-        <w:spacing w:after="60"/>
-      </w:pPr>
-      <w:r>
-        <w:t xml:space="preserve">I try to view situations from your point of view to anticipate your needs and assist you in building your antifragility.</w:t>
+        <w:keepNext/>
+        <w:spacing w:after="40" w:before="140"/>
+      </w:pPr>
+      <w:r>
+        <w:rPr>
+          <w:b/>
+          <w:bCs/>
+        </w:rPr>
+        <w:t xml:space="preserve">Description:</w:t>
+      </w:r>
+    </w:p>
+    <w:p>
+      <w:pPr>
+        <w:spacing w:after="100"/>
+      </w:pPr>
+      <w:r>
+        <w:t xml:space="preserve">Wrote Visuals, an application that uses interactive 3D graphics animation to reveal meaning in multidimensional statistical data</w:t>
+      </w:r>
+    </w:p>
+    <w:p>
+      <w:pPr>
+        <w:pStyle w:val="Heading2"/>
+        <w:keepNext/>
+        <w:keepLines/>
+      </w:pPr>
+      <w:r>
+        <w:t xml:space="preserve">Associate Public Policy Analyst</w:t>
+      </w:r>
+    </w:p>
+    <w:p>
+      <w:pPr>
+        <w:keepNext/>
+        <w:spacing w:after="0"/>
+      </w:pPr>
+      <w:r>
+        <w:t xml:space="preserve">Pacific Environmental Services, Inc | 01/1980 - 09/1982</w:t>
+      </w:r>
+    </w:p>
+    <w:p>
+      <w:pPr>
+        <w:keepNext/>
+        <w:spacing w:after="40" w:before="140"/>
+      </w:pPr>
+      <w:r>
+        <w:rPr>
+          <w:b/>
+          <w:bCs/>
+        </w:rPr>
+        <w:t xml:space="preserve">Description:</w:t>
+      </w:r>
+    </w:p>
+    <w:p>
+      <w:pPr>
+        <w:spacing w:after="100"/>
+      </w:pPr>
+      <w:r>
+        <w:t xml:space="preserve">Conducted regulatory technical analyses, managed preparation of technical business proposals, managed a waste brokerage program</w:t>
       </w:r>
     </w:p>
     <w:p>

</xml_diff>

<commit_message>
fixed "like GE ."
</commit_message>
<xml_diff>
--- a/src/static/resume.docx
+++ b/src/static/resume.docx
@@ -460,7 +460,7 @@
         <w:spacing w:after="100" w:before="260"/>
       </w:pPr>
       <w:r>
-        <w:t xml:space="preserve">"I know Doug Kent both personally and professionally. I have had the great pleasure of working with him on several projects at multiple companies. These include industry changing applications like Shiftwise (healthcare staffing vendor management systems) and at large companies like GE . He is a highly reliable and methodical .NET web developer, and the best OO developer I've worked with. Doug works well solo and on teams and is an excellent communicator in both settings. On that point, he is an open and honest person and one who is not afraid to speak up (appropriately) when necessary. He is my go to .NET developer for these reasons, and also because he takes full ownership of his work; including peripheral dependencies, and will self manage through to completion."</w:t>
+        <w:t xml:space="preserve">"I know Doug Kent both personally and professionally. I have had the great pleasure of working with him on several projects at multiple companies. These include industry changing applications like ShiftWise (healthcare staffing vendor management systems) and at large companies like GE . He is a highly reliable and methodical .NET web developer, and the best OO developer I've worked with. Doug works well solo and on teams and is an excellent communicator in both settings. On that point, he is an open and honest person and one who is not afraid to speak up (appropriately) when necessary. He is my go to .NET developer for these reasons, and also because he takes full ownership of his work; including peripheral dependencies, and will self manage through to completion."</w:t>
       </w:r>
     </w:p>
     <w:p>
@@ -473,7 +473,7 @@
           <w:b/>
           <w:bCs/>
         </w:rPr>
-        <w:t xml:space="preserve">Ross Barbieri, Serial Entrepreneur, CTO and Software Development Manager (Shiftwise)</w:t>
+        <w:t xml:space="preserve">Ross Barbieri, Serial Entrepreneur, CTO and Software Development Manager (ShiftWise)</w:t>
       </w:r>
     </w:p>
     <w:p>

</xml_diff>

<commit_message>
added "worksFor" to json-ld
</commit_message>
<xml_diff>
--- a/src/static/resume.docx
+++ b/src/static/resume.docx
@@ -3867,7 +3867,7 @@
           <w:rPr>
             <w:rStyle w:val="Hyperlink"/>
           </w:rPr>
-          <w:t xml:space="preserve">https://www.microsoft.com/</w:t>
+          <w:t xml:space="preserve">https://www.microsoft.com</w:t>
         </w:r>
       </w:hyperlink>
     </w:p>
@@ -3921,7 +3921,7 @@
           <w:rPr>
             <w:rStyle w:val="Hyperlink"/>
           </w:rPr>
-          <w:t xml:space="preserve">https://www.microsoft.com/</w:t>
+          <w:t xml:space="preserve">https://www.microsoft.com</w:t>
         </w:r>
       </w:hyperlink>
     </w:p>
@@ -4041,7 +4041,7 @@
           <w:rPr>
             <w:rStyle w:val="Hyperlink"/>
           </w:rPr>
-          <w:t xml:space="preserve">https://www.microsoft.com/</w:t>
+          <w:t xml:space="preserve">https://www.microsoft.com</w:t>
         </w:r>
       </w:hyperlink>
     </w:p>

</xml_diff>